<commit_message>
Refine The FairBanks Handbook (Version 1.0.0) with editorial updates, including improved publication information and enhanced clarity in institutional language and terminology. Adjustments made to the roadmap and success metrics to better reflect strategic goals for 2027-2032. This version marks the MASTER FREEZE with three editorial refinements applied.
</commit_message>
<xml_diff>
--- a/.cursor/source-of-truth/🚀 THE FAIRBANKS HANDBOOK_v1_0_0.docx
+++ b/.cursor/source-of-truth/🚀 THE FAIRBANKS HANDBOOK_v1_0_0.docx
@@ -31,7 +31,7 @@
           <w:color w:val="222222"/>
           <w:sz w:val="18"/>
         </w:rPr>
-        <w:t>Document control: Handbook Version 1.0.0 — derived from Blueprint Master Freeze v1.0.1 (.cursor/source-of-truth). Operational companion; not a rewrite of the Blueprint.</w:t>
+        <w:t>Document control: Handbook Version 1.0.0 — MASTER FREEZE (three editorial refinements applied; compact operational companion to Blueprint v1.0.1).</w:t>
       </w:r>
     </w:p>
     <w:p>
@@ -1622,7 +1622,7 @@
           <w:color w:val="222222"/>
           <w:sz w:val="22"/>
         </w:rPr>
-        <w:t>Keep 2030–2031 as a two-year Leadership stage. Do not compress it to force a five-year label.</w:t>
+        <w:t>The Leadership stage spans 2030–2031, reflecting the time required to consolidate institutional influence, partnerships, and leadership capacity.</w:t>
       </w:r>
     </w:p>
     <w:p>
@@ -3524,7 +3524,7 @@
           <w:color w:val="1A3A5C"/>
           <w:sz w:val="32"/>
         </w:rPr>
-        <w:t>9. Language locks (do not drift)</w:t>
+        <w:t>9. Institutional Language &amp; Terminology</w:t>
       </w:r>
     </w:p>
     <w:p>
@@ -3685,7 +3685,7 @@
           <w:color w:val="222222"/>
           <w:sz w:val="22"/>
         </w:rPr>
-        <w:t>Trusted integrated healthcare services</w:t>
+        <w:t>Trusted for integrated healthcare services</w:t>
       </w:r>
     </w:p>
     <w:p>
@@ -3701,7 +3701,7 @@
           <w:color w:val="222222"/>
           <w:sz w:val="22"/>
         </w:rPr>
-        <w:t>Excellence in community health and preventive care</w:t>
+        <w:t>Recognised for excellence in community health and preventive care</w:t>
       </w:r>
     </w:p>
     <w:p>
@@ -3717,7 +3717,7 @@
           <w:color w:val="222222"/>
           <w:sz w:val="22"/>
         </w:rPr>
-        <w:t>Leadership in digital health and community health intelligence</w:t>
+        <w:t>Recognised as a leader in digital health and community health intelligence</w:t>
       </w:r>
     </w:p>
     <w:p>
@@ -3733,7 +3733,7 @@
           <w:color w:val="222222"/>
           <w:sz w:val="22"/>
         </w:rPr>
-        <w:t>Respected research and innovation partnership</w:t>
+        <w:t>Recognised as a respected research and innovation partner</w:t>
       </w:r>
     </w:p>
     <w:p>
@@ -3749,7 +3749,7 @@
           <w:color w:val="222222"/>
           <w:sz w:val="22"/>
         </w:rPr>
-        <w:t>Preferred partnership with government, universities, insurers, and development agencies</w:t>
+        <w:t>Recognised as a preferred partner for government, universities, insurers, and development agencies</w:t>
       </w:r>
     </w:p>
     <w:p>
@@ -3765,7 +3765,7 @@
           <w:color w:val="222222"/>
           <w:sz w:val="22"/>
         </w:rPr>
-        <w:t>Financial sustainability with measurable social impact</w:t>
+        <w:t>Financially sustainable, with measurable social impact</w:t>
       </w:r>
     </w:p>
     <w:p>

</xml_diff>

<commit_message>
Update The FairBanks Handbook to Version 1.0.1, incorporating editorial refinements for clarity and consistency. This version includes adjustments to the institutional roadmap, enhanced formatting for improved readability, and updated publication details. Additionally, ensure proper storage of handbook companions in `.cursor/source-of-truth/` to avoid duplication.
</commit_message>
<xml_diff>
--- a/.cursor/source-of-truth/🚀 THE FAIRBANKS HANDBOOK_v1_0_0.docx
+++ b/.cursor/source-of-truth/🚀 THE FAIRBANKS HANDBOOK_v1_0_0.docx
@@ -20,7 +20,7 @@
     </w:p>
     <w:p>
       <w:pPr>
-        <w:spacing w:after="280" w:before="0" w:line="276" w:lineRule="auto"/>
+        <w:spacing w:after="100" w:before="0" w:line="276" w:lineRule="auto"/>
         <w:jc w:val="center"/>
       </w:pPr>
       <w:r>
@@ -100,7 +100,7 @@
     </w:p>
     <w:p>
       <w:pPr>
-        <w:spacing w:after="200" w:before="0" w:line="276" w:lineRule="auto"/>
+        <w:spacing w:after="100" w:before="0" w:line="276" w:lineRule="auto"/>
         <w:jc w:val="center"/>
       </w:pPr>
       <w:r>
@@ -116,7 +116,7 @@
     </w:p>
     <w:p>
       <w:pPr>
-        <w:spacing w:after="320" w:before="0" w:line="276" w:lineRule="auto"/>
+        <w:spacing w:after="100" w:before="0" w:line="276" w:lineRule="auto"/>
         <w:jc w:val="center"/>
       </w:pPr>
       <w:r>
@@ -419,7 +419,7 @@
     </w:p>
     <w:p>
       <w:pPr>
-        <w:pageBreakBefore/>
+        <w:pageBreakBefore w:val="0"/>
         <w:spacing w:after="160"/>
         <w:jc w:val="center"/>
       </w:pPr>
@@ -844,7 +844,7 @@
     <w:p/>
     <w:p>
       <w:pPr>
-        <w:pageBreakBefore/>
+        <w:pageBreakBefore w:val="0"/>
         <w:spacing w:after="160"/>
         <w:jc w:val="center"/>
       </w:pPr>
@@ -1226,7 +1226,7 @@
     </w:p>
     <w:p>
       <w:pPr>
-        <w:pageBreakBefore/>
+        <w:pageBreakBefore w:val="0"/>
         <w:spacing w:after="160"/>
         <w:jc w:val="center"/>
       </w:pPr>
@@ -1243,7 +1243,7 @@
     </w:p>
     <w:p>
       <w:pPr>
-        <w:spacing w:after="200" w:before="80" w:line="276" w:lineRule="auto"/>
+        <w:spacing w:after="100" w:before="80" w:line="276" w:lineRule="auto"/>
         <w:jc w:val="center"/>
       </w:pPr>
       <w:r>
@@ -1849,7 +1849,7 @@
     </w:p>
     <w:p>
       <w:pPr>
-        <w:pageBreakBefore/>
+        <w:pageBreakBefore w:val="0"/>
         <w:spacing w:after="160"/>
         <w:jc w:val="center"/>
       </w:pPr>
@@ -2389,7 +2389,7 @@
     </w:p>
     <w:p>
       <w:pPr>
-        <w:pageBreakBefore/>
+        <w:pageBreakBefore w:val="0"/>
         <w:spacing w:after="160"/>
         <w:jc w:val="center"/>
       </w:pPr>
@@ -3066,7 +3066,7 @@
     <w:p/>
     <w:p>
       <w:pPr>
-        <w:pageBreakBefore/>
+        <w:pageBreakBefore w:val="0"/>
         <w:spacing w:after="160"/>
         <w:jc w:val="center"/>
       </w:pPr>
@@ -3383,7 +3383,7 @@
     </w:p>
     <w:p>
       <w:pPr>
-        <w:pageBreakBefore/>
+        <w:pageBreakBefore w:val="0"/>
         <w:spacing w:after="160"/>
         <w:jc w:val="center"/>
       </w:pPr>
@@ -3512,7 +3512,7 @@
     </w:p>
     <w:p>
       <w:pPr>
-        <w:pageBreakBefore/>
+        <w:pageBreakBefore w:val="0"/>
         <w:spacing w:after="160"/>
         <w:jc w:val="center"/>
       </w:pPr>
@@ -3625,7 +3625,7 @@
     </w:p>
     <w:p>
       <w:pPr>
-        <w:pageBreakBefore/>
+        <w:pageBreakBefore w:val="0"/>
         <w:spacing w:after="160"/>
         <w:jc w:val="center"/>
       </w:pPr>
@@ -3786,7 +3786,7 @@
     </w:p>
     <w:p>
       <w:pPr>
-        <w:pageBreakBefore/>
+        <w:pageBreakBefore w:val="0"/>
         <w:spacing w:after="160"/>
         <w:jc w:val="center"/>
       </w:pPr>
@@ -3915,7 +3915,7 @@
     </w:p>
     <w:sectPr>
       <w:pgSz w:w="12240" w:h="15840"/>
-      <w:pgMar w:top="1296" w:right="1440" w:bottom="1296" w:left="1440" w:header="720" w:footer="720" w:gutter="0"/>
+      <w:pgMar w:top="1080" w:right="1440" w:bottom="1080" w:left="1440" w:header="720" w:footer="720" w:gutter="0"/>
       <w:cols w:space="720"/>
       <w:docGrid w:linePitch="360"/>
     </w:sectPr>

</xml_diff>